<commit_message>
Docs: refresh session summary — code cleanup, advisor-code security fix, ERD, PII security test, 3 pending SQL files
Co-Authored-By: Claude Fable 5 <noreply@anthropic.com>
</commit_message>
<xml_diff>
--- a/Project for Capstone 2/student_risk_system/Tom-tat-cuoc-chat.docx
+++ b/Project for Capstone 2/student_risk_system/Tom-tat-cuoc-chat.docx
@@ -19,7 +19,7 @@
     </w:p>
     <w:p>
       <w:pPr>
-        <w:spacing w:after="80"/>
+        <w:spacing w:after="70"/>
         <w:jc w:val="center"/>
       </w:pPr>
       <w:r>
@@ -36,47 +36,6 @@
     </w:p>
     <w:p>
       <w:pPr>
-        <w:spacing w:after="40"/>
-        <w:jc w:val="center"/>
-      </w:pPr>
-      <w:r>
-        <w:rPr>
-          <w:rFonts w:ascii="Calibri" w:cs="Calibri" w:eastAsia="Calibri" w:hAnsi="Calibri"/>
-          <w:color w:val="5C6678"/>
-          <w:sz w:val="23"/>
-          <w:szCs w:val="23"/>
-        </w:rPr>
-        <w:t xml:space="preserve">Nhật ký công việc — Hệ thống Cảnh báo Rủi ro Học tập</w:t>
-      </w:r>
-    </w:p>
-    <w:p>
-      <w:pPr>
-        <w:spacing w:after="40"/>
-        <w:jc w:val="center"/>
-      </w:pPr>
-      <w:r>
-        <w:rPr>
-          <w:rFonts w:ascii="Calibri" w:cs="Calibri" w:eastAsia="Calibri" w:hAnsi="Calibri"/>
-          <w:sz w:val="22"/>
-          <w:szCs w:val="22"/>
-        </w:rPr>
-        <w:t xml:space="preserve">Địa chỉ:  </w:t>
-      </w:r>
-      <w:hyperlink w:history="1" r:id="rIdsmq0qayvsajsiooer2rle">
-        <w:r>
-          <w:rPr>
-            <w:rFonts w:ascii="Calibri" w:cs="Calibri" w:eastAsia="Calibri" w:hAnsi="Calibri"/>
-            <w:color w:val="1B4FC4"/>
-            <w:sz w:val="22"/>
-            <w:szCs w:val="22"/>
-            <w:u w:val="single"/>
-          </w:rPr>
-          <w:t xml:space="preserve">https://hainam2k5-github-io.vercel.app</w:t>
-        </w:r>
-      </w:hyperlink>
-    </w:p>
-    <w:p>
-      <w:pPr>
         <w:spacing w:after="200"/>
         <w:jc w:val="center"/>
       </w:pPr>
@@ -84,10 +43,10 @@
         <w:rPr>
           <w:rFonts w:ascii="Calibri" w:cs="Calibri" w:eastAsia="Calibri" w:hAnsi="Calibri"/>
           <w:color w:val="5C6678"/>
-          <w:sz w:val="20"/>
-          <w:szCs w:val="20"/>
-        </w:rPr>
-        <w:t xml:space="preserve">Hệ thống Cảnh báo Rủi ro Học tập · 09/07/2026</w:t>
+          <w:sz w:val="22"/>
+          <w:szCs w:val="22"/>
+        </w:rPr>
+        <w:t xml:space="preserve">Hệ thống Cảnh báo Rủi ro Học tập · Cập nhật 11/07/2026</w:t>
       </w:r>
     </w:p>
     <w:p>
@@ -101,8 +60,8 @@
           <w:b/>
           <w:bCs/>
           <w:color w:val="13294F"/>
-          <w:sz w:val="28"/>
-          <w:szCs w:val="28"/>
+          <w:sz w:val="27"/>
+          <w:szCs w:val="27"/>
         </w:rPr>
         <w:t xml:space="preserve">1. Bối cảnh</w:t>
       </w:r>
@@ -117,7 +76,7 @@
           <w:sz w:val="22"/>
           <w:szCs w:val="22"/>
         </w:rPr>
-        <w:t xml:space="preserve">Đồ án Capstone (INS3282): web cảnh báo rủi ro học tập (Next.js + Supabase, deploy Vercel), song ngữ VI/EN. Phiên làm việc đi từ hoàn thiện dở dang → mô hình “trường thật” → áp dụng nghiên cứu học thuật.</w:t>
+        <w:t xml:space="preserve">Đồ án Capstone (INS3282): web cảnh báo rủi ro học tập (Next.js + Supabase, deploy Vercel), song ngữ VI/EN. Phiên làm việc đi từ hoàn thiện dở dang → mô hình “trường thật” → áp dụng nghiên cứu học thuật → dọn code &amp; rà soát bảo mật.</w:t>
       </w:r>
     </w:p>
     <w:p>
@@ -131,8 +90,8 @@
           <w:b/>
           <w:bCs/>
           <w:color w:val="13294F"/>
-          <w:sz w:val="28"/>
-          <w:szCs w:val="28"/>
+          <w:sz w:val="27"/>
+          <w:szCs w:val="27"/>
         </w:rPr>
         <w:t xml:space="preserve">2. Các giai đoạn chính</w:t>
       </w:r>
@@ -152,115 +111,151 @@
           <w:sz w:val="22"/>
           <w:szCs w:val="22"/>
         </w:rPr>
-        <w:t xml:space="preserve">Khôi phục ngữ cảnh, tiếp tục file i18n dang dở (dịch Anh cho quên mật khẩu).</w:t>
-      </w:r>
-    </w:p>
-    <w:p>
-      <w:pPr>
-        <w:pStyle w:val="ListParagraph"/>
-        <w:numPr>
-          <w:ilvl w:val="0"/>
-          <w:numId w:val="2"/>
-        </w:numPr>
-        <w:spacing w:after="60"/>
-      </w:pPr>
-      <w:r>
-        <w:rPr>
-          <w:rFonts w:ascii="Calibri" w:cs="Calibri" w:eastAsia="Calibri" w:hAnsi="Calibri"/>
-          <w:sz w:val="22"/>
-          <w:szCs w:val="22"/>
-        </w:rPr>
-        <w:t xml:space="preserve">Xây quên mật khẩu bằng mã 6 số (Supabase OTP); chỉnh giao diện theo logo VNU-IS (navy + gold); logo góc trái bấm về Tổng quan.</w:t>
-      </w:r>
-    </w:p>
-    <w:p>
-      <w:pPr>
-        <w:pStyle w:val="ListParagraph"/>
-        <w:numPr>
-          <w:ilvl w:val="0"/>
-          <w:numId w:val="2"/>
-        </w:numPr>
-        <w:spacing w:after="60"/>
-      </w:pPr>
-      <w:r>
-        <w:rPr>
-          <w:rFonts w:ascii="Calibri" w:cs="Calibri" w:eastAsia="Calibri" w:hAnsi="Calibri"/>
-          <w:sz w:val="22"/>
-          <w:szCs w:val="22"/>
-        </w:rPr>
-        <w:t xml:space="preserve">Deploy Vercel + Supabase; vá lỗi CSP chặn unsafe-eval khiến dev không hydrate; thêm HTTP security headers; rà soát bảo mật.</w:t>
-      </w:r>
-    </w:p>
-    <w:p>
-      <w:pPr>
-        <w:pStyle w:val="ListParagraph"/>
-        <w:numPr>
-          <w:ilvl w:val="0"/>
-          <w:numId w:val="2"/>
-        </w:numPr>
-        <w:spacing w:after="60"/>
-      </w:pPr>
-      <w:r>
-        <w:rPr>
-          <w:rFonts w:ascii="Calibri" w:cs="Calibri" w:eastAsia="Calibri" w:hAnsi="Calibri"/>
-          <w:sz w:val="22"/>
-          <w:szCs w:val="22"/>
-        </w:rPr>
-        <w:t xml:space="preserve">Chuyển sang mô hình “trường cấp tài khoản”: bỏ đăng ký công khai → chỉ đăng nhập; endpoint admin (service_role) tạo tài khoản SV theo MSSV; bỏ dữ liệu demo.</w:t>
-      </w:r>
-    </w:p>
-    <w:p>
-      <w:pPr>
-        <w:pStyle w:val="ListParagraph"/>
-        <w:numPr>
-          <w:ilvl w:val="0"/>
-          <w:numId w:val="2"/>
-        </w:numPr>
-        <w:spacing w:after="60"/>
-      </w:pPr>
-      <w:r>
-        <w:rPr>
-          <w:rFonts w:ascii="Calibri" w:cs="Calibri" w:eastAsia="Calibri" w:hAnsi="Calibri"/>
-          <w:sz w:val="22"/>
-          <w:szCs w:val="22"/>
-        </w:rPr>
-        <w:t xml:space="preserve">Nhập điểm theo MSSV; tạo 10 sinh viên mẫu (môn/năm/tín chỉ ngẫu nhiên, 12–24 TC/kỳ) qua CSV và SQL; cho phép email thường.</w:t>
-      </w:r>
-    </w:p>
-    <w:p>
-      <w:pPr>
-        <w:pStyle w:val="ListParagraph"/>
-        <w:numPr>
-          <w:ilvl w:val="0"/>
-          <w:numId w:val="2"/>
-        </w:numPr>
-        <w:spacing w:after="60"/>
-      </w:pPr>
-      <w:r>
-        <w:rPr>
-          <w:rFonts w:ascii="Calibri" w:cs="Calibri" w:eastAsia="Calibri" w:hAnsi="Calibri"/>
-          <w:sz w:val="22"/>
-          <w:szCs w:val="22"/>
-        </w:rPr>
-        <w:t xml:space="preserve">Chuyển email báo điểm sang Gmail SMTP (không cần domain).</w:t>
-      </w:r>
-    </w:p>
-    <w:p>
-      <w:pPr>
-        <w:pStyle w:val="ListParagraph"/>
-        <w:numPr>
-          <w:ilvl w:val="0"/>
-          <w:numId w:val="2"/>
-        </w:numPr>
-        <w:spacing w:after="60"/>
-      </w:pPr>
-      <w:r>
-        <w:rPr>
-          <w:rFonts w:ascii="Calibri" w:cs="Calibri" w:eastAsia="Calibri" w:hAnsi="Calibri"/>
-          <w:sz w:val="22"/>
-          <w:szCs w:val="22"/>
-        </w:rPr>
-        <w:t xml:space="preserve">Nghiên cứu 4 tài liệu + 7 nguồn ngoài → phân tích khoảng trống → chọn hướng “vòng lặp cảnh báo có kiểm chứng”.</w:t>
+        <w:t xml:space="preserve">Khôi phục ngữ cảnh; hoàn thiện file i18n dở (dịch Anh cho quên mật khẩu).</w:t>
+      </w:r>
+    </w:p>
+    <w:p>
+      <w:pPr>
+        <w:pStyle w:val="ListParagraph"/>
+        <w:numPr>
+          <w:ilvl w:val="0"/>
+          <w:numId w:val="2"/>
+        </w:numPr>
+        <w:spacing w:after="60"/>
+      </w:pPr>
+      <w:r>
+        <w:rPr>
+          <w:rFonts w:ascii="Calibri" w:cs="Calibri" w:eastAsia="Calibri" w:hAnsi="Calibri"/>
+          <w:sz w:val="22"/>
+          <w:szCs w:val="22"/>
+        </w:rPr>
+        <w:t xml:space="preserve">Quên mật khẩu bằng mã 6 số (Supabase OTP); giao diện theo logo VNU-IS (navy + gold); logo góc trái bấm về Tổng quan.</w:t>
+      </w:r>
+    </w:p>
+    <w:p>
+      <w:pPr>
+        <w:pStyle w:val="ListParagraph"/>
+        <w:numPr>
+          <w:ilvl w:val="0"/>
+          <w:numId w:val="2"/>
+        </w:numPr>
+        <w:spacing w:after="60"/>
+      </w:pPr>
+      <w:r>
+        <w:rPr>
+          <w:rFonts w:ascii="Calibri" w:cs="Calibri" w:eastAsia="Calibri" w:hAnsi="Calibri"/>
+          <w:sz w:val="22"/>
+          <w:szCs w:val="22"/>
+        </w:rPr>
+        <w:t xml:space="preserve">Deploy Vercel + Supabase; vá lỗi CSP chặn unsafe-eval (dev không hydrate); thêm HTTP security headers.</w:t>
+      </w:r>
+    </w:p>
+    <w:p>
+      <w:pPr>
+        <w:pStyle w:val="ListParagraph"/>
+        <w:numPr>
+          <w:ilvl w:val="0"/>
+          <w:numId w:val="2"/>
+        </w:numPr>
+        <w:spacing w:after="60"/>
+      </w:pPr>
+      <w:r>
+        <w:rPr>
+          <w:rFonts w:ascii="Calibri" w:cs="Calibri" w:eastAsia="Calibri" w:hAnsi="Calibri"/>
+          <w:sz w:val="22"/>
+          <w:szCs w:val="22"/>
+        </w:rPr>
+        <w:t xml:space="preserve">Mô hình “trường cấp tài khoản”: bỏ đăng ký công khai → chỉ đăng nhập; endpoint admin (service_role) tạo tài khoản theo MSSV; bỏ dữ liệu demo.</w:t>
+      </w:r>
+    </w:p>
+    <w:p>
+      <w:pPr>
+        <w:pStyle w:val="ListParagraph"/>
+        <w:numPr>
+          <w:ilvl w:val="0"/>
+          <w:numId w:val="2"/>
+        </w:numPr>
+        <w:spacing w:after="60"/>
+      </w:pPr>
+      <w:r>
+        <w:rPr>
+          <w:rFonts w:ascii="Calibri" w:cs="Calibri" w:eastAsia="Calibri" w:hAnsi="Calibri"/>
+          <w:sz w:val="22"/>
+          <w:szCs w:val="22"/>
+        </w:rPr>
+        <w:t xml:space="preserve">Nhập điểm theo MSSV; 10 sinh viên mẫu (môn/năm/tín chỉ ngẫu nhiên, 12–24 TC/kỳ); email thường; email báo điểm qua Gmail SMTP.</w:t>
+      </w:r>
+    </w:p>
+    <w:p>
+      <w:pPr>
+        <w:pStyle w:val="ListParagraph"/>
+        <w:numPr>
+          <w:ilvl w:val="0"/>
+          <w:numId w:val="2"/>
+        </w:numPr>
+        <w:spacing w:after="60"/>
+      </w:pPr>
+      <w:r>
+        <w:rPr>
+          <w:rFonts w:ascii="Calibri" w:cs="Calibri" w:eastAsia="Calibri" w:hAnsi="Calibri"/>
+          <w:sz w:val="22"/>
+          <w:szCs w:val="22"/>
+        </w:rPr>
+        <w:t xml:space="preserve">Nghiên cứu 4 tài liệu + 7 nguồn ngoài → hướng “vòng lặp cảnh báo có kiểm chứng”.</w:t>
+      </w:r>
+    </w:p>
+    <w:p>
+      <w:pPr>
+        <w:pStyle w:val="ListParagraph"/>
+        <w:numPr>
+          <w:ilvl w:val="0"/>
+          <w:numId w:val="2"/>
+        </w:numPr>
+        <w:spacing w:after="60"/>
+      </w:pPr>
+      <w:r>
+        <w:rPr>
+          <w:rFonts w:ascii="Calibri" w:cs="Calibri" w:eastAsia="Calibri" w:hAnsi="Calibri"/>
+          <w:sz w:val="22"/>
+          <w:szCs w:val="22"/>
+        </w:rPr>
+        <w:t xml:space="preserve">Triển khai: trang Đánh giá (Precision/Recall/F1 + hiệu quả can thiệp); nhập điểm tối ưu (bảng theo môn, import xem-trước, xuất Excel, khóa điểm); email tự cảnh báo tới SV; ngưỡng &amp; trọng số rủi ro tùy chỉnh.</w:t>
+      </w:r>
+    </w:p>
+    <w:p>
+      <w:pPr>
+        <w:pStyle w:val="ListParagraph"/>
+        <w:numPr>
+          <w:ilvl w:val="0"/>
+          <w:numId w:val="2"/>
+        </w:numPr>
+        <w:spacing w:after="60"/>
+      </w:pPr>
+      <w:r>
+        <w:rPr>
+          <w:rFonts w:ascii="Calibri" w:cs="Calibri" w:eastAsia="Calibri" w:hAnsi="Calibri"/>
+          <w:sz w:val="22"/>
+          <w:szCs w:val="22"/>
+        </w:rPr>
+        <w:t xml:space="preserve">Dọn code: gỡ 21 key i18n chết; gỡ cơ chế “mã cố vấn” (vá lỗ hổng leo thang qua signup API); vẽ ERD.</w:t>
+      </w:r>
+    </w:p>
+    <w:p>
+      <w:pPr>
+        <w:pStyle w:val="ListParagraph"/>
+        <w:numPr>
+          <w:ilvl w:val="0"/>
+          <w:numId w:val="2"/>
+        </w:numPr>
+        <w:spacing w:after="60"/>
+      </w:pPr>
+      <w:r>
+        <w:rPr>
+          <w:rFonts w:ascii="Calibri" w:cs="Calibri" w:eastAsia="Calibri" w:hAnsi="Calibri"/>
+          <w:sz w:val="22"/>
+          <w:szCs w:val="22"/>
+        </w:rPr>
+        <w:t xml:space="preserve">Rà soát bảo mật cuối trên web thật.</w:t>
       </w:r>
     </w:p>
     <w:p>
@@ -274,8 +269,8 @@
           <w:b/>
           <w:bCs/>
           <w:color w:val="13294F"/>
-          <w:sz w:val="28"/>
-          <w:szCs w:val="28"/>
+          <w:sz w:val="27"/>
+          <w:szCs w:val="27"/>
         </w:rPr>
         <w:t xml:space="preserve">3. Tính năng đã xây dựng</w:t>
       </w:r>
@@ -293,8 +288,8 @@
         </w:tblBorders>
       </w:tblPr>
       <w:tblGrid>
-        <w:gridCol w:w="3200"/>
-        <w:gridCol w:w="6160"/>
+        <w:gridCol w:w="3100"/>
+        <w:gridCol w:w="6260"/>
       </w:tblGrid>
       <w:tr>
         <w:trPr>
@@ -302,7 +297,7 @@
         </w:trPr>
         <w:tc>
           <w:tcPr>
-            <w:tcW w:type="dxa" w:w="3200"/>
+            <w:tcW w:type="dxa" w:w="3100"/>
             <w:shd w:fill="13294F" w:val="clear"/>
             <w:tcMar>
               <w:top w:type="dxa" w:w="58"/>
@@ -330,7 +325,7 @@
         </w:tc>
         <w:tc>
           <w:tcPr>
-            <w:tcW w:type="dxa" w:w="6160"/>
+            <w:tcW w:type="dxa" w:w="6260"/>
             <w:shd w:fill="13294F" w:val="clear"/>
             <w:tcMar>
               <w:top w:type="dxa" w:w="58"/>
@@ -360,7 +355,7 @@
       <w:tr>
         <w:tc>
           <w:tcPr>
-            <w:tcW w:type="dxa" w:w="3200"/>
+            <w:tcW w:type="dxa" w:w="3100"/>
             <w:tcMar>
               <w:top w:type="dxa" w:w="58"/>
               <w:left w:type="dxa" w:w="95"/>
@@ -386,7 +381,7 @@
         </w:tc>
         <w:tc>
           <w:tcPr>
-            <w:tcW w:type="dxa" w:w="6160"/>
+            <w:tcW w:type="dxa" w:w="6260"/>
             <w:tcMar>
               <w:top w:type="dxa" w:w="58"/>
               <w:left w:type="dxa" w:w="95"/>
@@ -406,7 +401,7 @@
                 <w:sz w:val="20"/>
                 <w:szCs w:val="20"/>
               </w:rPr>
-              <w:t xml:space="preserve">Chỉ đăng nhập, quên mật khẩu mã 6 số, tài khoản do trường cấp</w:t>
+              <w:t xml:space="preserve">Chỉ đăng nhập, quên mật khẩu mã 6 số, tài khoản do trường cấp (không đăng ký công khai)</w:t>
             </w:r>
           </w:p>
         </w:tc>
@@ -414,7 +409,7 @@
       <w:tr>
         <w:tc>
           <w:tcPr>
-            <w:tcW w:type="dxa" w:w="3200"/>
+            <w:tcW w:type="dxa" w:w="3100"/>
             <w:shd w:fill="EEF2F8" w:val="clear"/>
             <w:tcMar>
               <w:top w:type="dxa" w:w="58"/>
@@ -441,7 +436,7 @@
         </w:tc>
         <w:tc>
           <w:tcPr>
-            <w:tcW w:type="dxa" w:w="6160"/>
+            <w:tcW w:type="dxa" w:w="6260"/>
             <w:shd w:fill="EEF2F8" w:val="clear"/>
             <w:tcMar>
               <w:top w:type="dxa" w:w="58"/>
@@ -462,7 +457,7 @@
                 <w:sz w:val="20"/>
                 <w:szCs w:val="20"/>
               </w:rPr>
-              <w:t xml:space="preserve">Bảng điểm theo môn (grid), nhập Excel có xem trước/kiểm lỗi/nhanh, xuất Excel, khóa điểm, kiểm 0–10</w:t>
+              <w:t xml:space="preserve">Bảng điểm theo môn (grid), nhập Excel xem-trước/kiểm-lỗi/nhanh, xuất Excel, khóa điểm, kiểm 0–10</w:t>
             </w:r>
           </w:p>
         </w:tc>
@@ -470,7 +465,7 @@
       <w:tr>
         <w:tc>
           <w:tcPr>
-            <w:tcW w:type="dxa" w:w="3200"/>
+            <w:tcW w:type="dxa" w:w="3100"/>
             <w:tcMar>
               <w:top w:type="dxa" w:w="58"/>
               <w:left w:type="dxa" w:w="95"/>
@@ -496,7 +491,7 @@
         </w:tc>
         <w:tc>
           <w:tcPr>
-            <w:tcW w:type="dxa" w:w="6160"/>
+            <w:tcW w:type="dxa" w:w="6260"/>
             <w:tcMar>
               <w:top w:type="dxa" w:w="58"/>
               <w:left w:type="dxa" w:w="95"/>
@@ -516,7 +511,7 @@
                 <w:sz w:val="20"/>
                 <w:szCs w:val="20"/>
               </w:rPr>
-              <w:t xml:space="preserve">Chấm đa yếu tố (giải thích được), dự đoán, ngưỡng &amp; trọng số tùy chỉnh</w:t>
+              <w:t xml:space="preserve">Chấm đa yếu tố (giải thích được), dự đoán vào vùng báo động, ngưỡng &amp; trọng số tùy chỉnh</w:t>
             </w:r>
           </w:p>
         </w:tc>
@@ -524,7 +519,7 @@
       <w:tr>
         <w:tc>
           <w:tcPr>
-            <w:tcW w:type="dxa" w:w="3200"/>
+            <w:tcW w:type="dxa" w:w="3100"/>
             <w:shd w:fill="EEF2F8" w:val="clear"/>
             <w:tcMar>
               <w:top w:type="dxa" w:w="58"/>
@@ -551,7 +546,7 @@
         </w:tc>
         <w:tc>
           <w:tcPr>
-            <w:tcW w:type="dxa" w:w="6160"/>
+            <w:tcW w:type="dxa" w:w="6260"/>
             <w:shd w:fill="EEF2F8" w:val="clear"/>
             <w:tcMar>
               <w:top w:type="dxa" w:w="58"/>
@@ -572,7 +567,7 @@
                 <w:sz w:val="20"/>
                 <w:szCs w:val="20"/>
               </w:rPr>
-              <w:t xml:space="preserve">Tự mở cảnh báo, ghi nhận can thiệp, email tự cảnh báo tới SV</w:t>
+              <w:t xml:space="preserve">Tự mở cảnh báo, ghi nhận can thiệp, email tự cảnh báo tới sinh viên</w:t>
             </w:r>
           </w:p>
         </w:tc>
@@ -580,7 +575,7 @@
       <w:tr>
         <w:tc>
           <w:tcPr>
-            <w:tcW w:type="dxa" w:w="3200"/>
+            <w:tcW w:type="dxa" w:w="3100"/>
             <w:tcMar>
               <w:top w:type="dxa" w:w="58"/>
               <w:left w:type="dxa" w:w="95"/>
@@ -606,7 +601,7 @@
         </w:tc>
         <w:tc>
           <w:tcPr>
-            <w:tcW w:type="dxa" w:w="6160"/>
+            <w:tcW w:type="dxa" w:w="6260"/>
             <w:tcMar>
               <w:top w:type="dxa" w:w="58"/>
               <w:left w:type="dxa" w:w="95"/>
@@ -626,7 +621,7 @@
                 <w:sz w:val="20"/>
                 <w:szCs w:val="20"/>
               </w:rPr>
-              <w:t xml:space="preserve">Precision/Recall/F1 + đo hiệu quả can thiệp</w:t>
+              <w:t xml:space="preserve">Precision/Recall/F1 + đo hiệu quả can thiệp (rủi ro trước/sau)</w:t>
             </w:r>
           </w:p>
         </w:tc>
@@ -634,7 +629,7 @@
       <w:tr>
         <w:tc>
           <w:tcPr>
-            <w:tcW w:type="dxa" w:w="3200"/>
+            <w:tcW w:type="dxa" w:w="3100"/>
             <w:shd w:fill="EEF2F8" w:val="clear"/>
             <w:tcMar>
               <w:top w:type="dxa" w:w="58"/>
@@ -661,7 +656,7 @@
         </w:tc>
         <w:tc>
           <w:tcPr>
-            <w:tcW w:type="dxa" w:w="6160"/>
+            <w:tcW w:type="dxa" w:w="6260"/>
             <w:shd w:fill="EEF2F8" w:val="clear"/>
             <w:tcMar>
               <w:top w:type="dxa" w:w="58"/>
@@ -689,11 +684,6 @@
       </w:tr>
     </w:tbl>
     <w:p>
-      <w:r>
-        <w:br w:type="page"/>
-      </w:r>
-    </w:p>
-    <w:p>
       <w:pPr>
         <w:pStyle w:val="Heading1"/>
         <w:spacing w:after="110" w:before="280"/>
@@ -704,64 +694,130 @@
           <w:b/>
           <w:bCs/>
           <w:color w:val="13294F"/>
-          <w:sz w:val="28"/>
-          <w:szCs w:val="28"/>
-        </w:rPr>
-        <w:t xml:space="preserve">4. Sản phẩm kèm theo</w:t>
-      </w:r>
-    </w:p>
-    <w:p>
-      <w:pPr>
-        <w:pStyle w:val="ListParagraph"/>
-        <w:numPr>
-          <w:ilvl w:val="0"/>
-          <w:numId w:val="2"/>
-        </w:numPr>
-        <w:spacing w:after="60"/>
-      </w:pPr>
-      <w:r>
-        <w:rPr>
-          <w:rFonts w:ascii="Calibri" w:cs="Calibri" w:eastAsia="Calibri" w:hAnsi="Calibri"/>
-          <w:sz w:val="22"/>
-          <w:szCs w:val="22"/>
-        </w:rPr>
-        <w:t xml:space="preserve">Tài liệu (.docx/.pdf): Hướng dẫn sử dụng &amp; quản trị, Hướng dẫn tính năng mới, Tạo/Danh sách tài khoản, Wireframe, bản tóm tắt này.</w:t>
-      </w:r>
-    </w:p>
-    <w:p>
-      <w:pPr>
-        <w:pStyle w:val="ListParagraph"/>
-        <w:numPr>
-          <w:ilvl w:val="0"/>
-          <w:numId w:val="2"/>
-        </w:numPr>
-        <w:spacing w:after="60"/>
-      </w:pPr>
-      <w:r>
-        <w:rPr>
-          <w:rFonts w:ascii="Calibri" w:cs="Calibri" w:eastAsia="Calibri" w:hAnsi="Calibri"/>
-          <w:sz w:val="22"/>
-          <w:szCs w:val="22"/>
-        </w:rPr>
-        <w:t xml:space="preserve">Dữ liệu mẫu: sinh-vien-mau.csv, diem-mau.csv, sample-data.sql.</w:t>
-      </w:r>
-    </w:p>
-    <w:p>
-      <w:pPr>
-        <w:pStyle w:val="ListParagraph"/>
-        <w:numPr>
-          <w:ilvl w:val="0"/>
-          <w:numId w:val="2"/>
-        </w:numPr>
-        <w:spacing w:after="60"/>
-      </w:pPr>
-      <w:r>
-        <w:rPr>
-          <w:rFonts w:ascii="Calibri" w:cs="Calibri" w:eastAsia="Calibri" w:hAnsi="Calibri"/>
-          <w:sz w:val="22"/>
-          <w:szCs w:val="22"/>
-        </w:rPr>
-        <w:t xml:space="preserve">Migration SQL: schema.sql, advisor-signup-code.sql, rls-major-scope.sql, auto-assign-advisor.sql, risk-config.sql, grade-lock.sql.</w:t>
+          <w:sz w:val="27"/>
+          <w:szCs w:val="27"/>
+        </w:rPr>
+        <w:t xml:space="preserve">4. Bảo mật (đã kiểm chứng trên web thật)</w:t>
+      </w:r>
+    </w:p>
+    <w:p>
+      <w:pPr>
+        <w:pStyle w:val="ListParagraph"/>
+        <w:numPr>
+          <w:ilvl w:val="0"/>
+          <w:numId w:val="2"/>
+        </w:numPr>
+        <w:spacing w:after="60"/>
+      </w:pPr>
+      <w:r>
+        <w:rPr>
+          <w:rFonts w:ascii="Calibri" w:cs="Calibri" w:eastAsia="Calibri" w:hAnsi="Calibri"/>
+          <w:sz w:val="22"/>
+          <w:szCs w:val="22"/>
+        </w:rPr>
+        <w:t xml:space="preserve">Người lạ (không đăng nhập) truy vấn mọi bảng dữ liệu SV → RLS trả rỗng: KHÔNG lộ thông tin cá nhân.</w:t>
+      </w:r>
+    </w:p>
+    <w:p>
+      <w:pPr>
+        <w:pStyle w:val="ListParagraph"/>
+        <w:numPr>
+          <w:ilvl w:val="0"/>
+          <w:numId w:val="2"/>
+        </w:numPr>
+        <w:spacing w:after="60"/>
+      </w:pPr>
+      <w:r>
+        <w:rPr>
+          <w:rFonts w:ascii="Calibri" w:cs="Calibri" w:eastAsia="Calibri" w:hAnsi="Calibri"/>
+          <w:sz w:val="22"/>
+          <w:szCs w:val="22"/>
+        </w:rPr>
+        <w:t xml:space="preserve">Sinh viên A không đọc được dữ liệu của sinh viên B (RLS gắn mọi truy vấn với hồ sơ của chính họ).</w:t>
+      </w:r>
+    </w:p>
+    <w:p>
+      <w:pPr>
+        <w:pStyle w:val="ListParagraph"/>
+        <w:numPr>
+          <w:ilvl w:val="0"/>
+          <w:numId w:val="2"/>
+        </w:numPr>
+        <w:spacing w:after="60"/>
+      </w:pPr>
+      <w:r>
+        <w:rPr>
+          <w:rFonts w:ascii="Calibri" w:cs="Calibri" w:eastAsia="Calibri" w:hAnsi="Calibri"/>
+          <w:sz w:val="22"/>
+          <w:szCs w:val="22"/>
+        </w:rPr>
+        <w:t xml:space="preserve">3 endpoint API (notify-grade, notify-alert, admin/import-students) đều chặn 401 nếu không có token; kiểm tra vai trò.</w:t>
+      </w:r>
+    </w:p>
+    <w:p>
+      <w:pPr>
+        <w:pStyle w:val="ListParagraph"/>
+        <w:numPr>
+          <w:ilvl w:val="0"/>
+          <w:numId w:val="2"/>
+        </w:numPr>
+        <w:spacing w:after="60"/>
+      </w:pPr>
+      <w:r>
+        <w:rPr>
+          <w:rFonts w:ascii="Calibri" w:cs="Calibri" w:eastAsia="Calibri" w:hAnsi="Calibri"/>
+          <w:sz w:val="22"/>
+          <w:szCs w:val="22"/>
+        </w:rPr>
+        <w:t xml:space="preserve">service_role &amp; mật khẩu Gmail chỉ ở server (biến môi trường Vercel). HTTP headers: CSP, HSTS, nosniff, X-Frame-Options DENY.</w:t>
+      </w:r>
+    </w:p>
+    <w:p>
+      <w:pPr>
+        <w:pStyle w:val="ListParagraph"/>
+        <w:numPr>
+          <w:ilvl w:val="0"/>
+          <w:numId w:val="2"/>
+        </w:numPr>
+        <w:spacing w:after="60"/>
+      </w:pPr>
+      <w:r>
+        <w:rPr>
+          <w:rFonts w:ascii="Calibri" w:cs="Calibri" w:eastAsia="Calibri" w:hAnsi="Calibri"/>
+          <w:sz w:val="22"/>
+          <w:szCs w:val="22"/>
+        </w:rPr>
+        <w:t xml:space="preserve">Đã vá: bỏ đường “mã cố vấn” — signup API không thể tự trở thành cố vấn.</w:t>
+      </w:r>
+    </w:p>
+    <w:p>
+      <w:pPr>
+        <w:pBdr>
+          <w:left w:val="single" w:color="157F3C" w:sz="18"/>
+        </w:pBdr>
+        <w:shd w:fill="EAF5EE" w:val="clear"/>
+        <w:spacing w:after="120"/>
+        <w:ind w:left="120"/>
+      </w:pPr>
+      <w:r>
+        <w:rPr>
+          <w:rFonts w:ascii="Calibri" w:cs="Calibri" w:eastAsia="Calibri" w:hAnsi="Calibri"/>
+          <w:b/>
+          <w:bCs/>
+          <w:color w:val="135F32"/>
+          <w:sz w:val="22"/>
+          <w:szCs w:val="22"/>
+        </w:rPr>
+        <w:t xml:space="preserve">Bảo mật: </w:t>
+      </w:r>
+      <w:r>
+        <w:rPr>
+          <w:rFonts w:ascii="Calibri" w:cs="Calibri" w:eastAsia="Calibri" w:hAnsi="Calibri"/>
+          <w:color w:val="2b2b2b"/>
+          <w:sz w:val="22"/>
+          <w:szCs w:val="22"/>
+        </w:rPr>
+        <w:t xml:space="preserve">Còn 1 lớp nên siết: chạy rls-major-scope.sql để cố vấn chỉ đọc/ghi được sinh viên mình phụ trách (chống cố vấn tự lên manager / đọc SV ngành khác qua API).</w:t>
       </w:r>
     </w:p>
     <w:p>
@@ -775,14 +831,100 @@
           <w:b/>
           <w:bCs/>
           <w:color w:val="13294F"/>
-          <w:sz w:val="28"/>
-          <w:szCs w:val="28"/>
-        </w:rPr>
-        <w:t xml:space="preserve">5. Hiện trạng &amp; việc còn lại</w:t>
-      </w:r>
-    </w:p>
-    <w:p>
-      Web live tại 
+          <w:sz w:val="27"/>
+          <w:szCs w:val="27"/>
+        </w:rPr>
+        <w:t xml:space="preserve">5. Sản phẩm kèm theo</w:t>
+      </w:r>
+    </w:p>
+    <w:p>
+      <w:pPr>
+        <w:pStyle w:val="ListParagraph"/>
+        <w:numPr>
+          <w:ilvl w:val="0"/>
+          <w:numId w:val="2"/>
+        </w:numPr>
+        <w:spacing w:after="60"/>
+      </w:pPr>
+      <w:r>
+        <w:rPr>
+          <w:rFonts w:ascii="Calibri" w:cs="Calibri" w:eastAsia="Calibri" w:hAnsi="Calibri"/>
+          <w:sz w:val="22"/>
+          <w:szCs w:val="22"/>
+        </w:rPr>
+        <w:t xml:space="preserve">Tài liệu (.docx/.pdf): Hướng dẫn sử dụng website (kèm tài khoản), Hướng dẫn sử dụng &amp; quản trị, Hướng dẫn tính năng mới, Tạo/Danh sách tài khoản sinh viên, Wireframe, bản tóm tắt này.</w:t>
+      </w:r>
+    </w:p>
+    <w:p>
+      <w:pPr>
+        <w:pStyle w:val="ListParagraph"/>
+        <w:numPr>
+          <w:ilvl w:val="0"/>
+          <w:numId w:val="2"/>
+        </w:numPr>
+        <w:spacing w:after="60"/>
+      </w:pPr>
+      <w:r>
+        <w:rPr>
+          <w:rFonts w:ascii="Calibri" w:cs="Calibri" w:eastAsia="Calibri" w:hAnsi="Calibri"/>
+          <w:sz w:val="22"/>
+          <w:szCs w:val="22"/>
+        </w:rPr>
+        <w:t xml:space="preserve">Dữ liệu mẫu: sinh-vien-mau.csv, diem-mau.csv, sample-data.sql.</w:t>
+      </w:r>
+    </w:p>
+    <w:p>
+      <w:pPr>
+        <w:pStyle w:val="ListParagraph"/>
+        <w:numPr>
+          <w:ilvl w:val="0"/>
+          <w:numId w:val="2"/>
+        </w:numPr>
+        <w:spacing w:after="60"/>
+      </w:pPr>
+      <w:r>
+        <w:rPr>
+          <w:rFonts w:ascii="Calibri" w:cs="Calibri" w:eastAsia="Calibri" w:hAnsi="Calibri"/>
+          <w:sz w:val="22"/>
+          <w:szCs w:val="22"/>
+        </w:rPr>
+        <w:t xml:space="preserve">Migration SQL: schema.sql, hardening.sql, auto-assign-advisor.sql, rls-major-scope.sql, remove-advisor-code.sql, risk-config.sql, grade-lock.sql.</w:t>
+      </w:r>
+    </w:p>
+    <w:p>
+      <w:pPr>
+        <w:pStyle w:val="Heading1"/>
+        <w:spacing w:after="110" w:before="280"/>
+      </w:pPr>
+      <w:r>
+        <w:rPr>
+          <w:rFonts w:ascii="Calibri" w:cs="Calibri" w:eastAsia="Calibri" w:hAnsi="Calibri"/>
+          <w:b/>
+          <w:bCs/>
+          <w:color w:val="13294F"/>
+          <w:sz w:val="27"/>
+          <w:szCs w:val="27"/>
+        </w:rPr>
+        <w:t xml:space="preserve">6. Hiện trạng &amp; việc còn lại</w:t>
+      </w:r>
+    </w:p>
+    <w:p>
+      <w:pPr>
+        <w:pStyle w:val="ListParagraph"/>
+        <w:numPr>
+          <w:ilvl w:val="0"/>
+          <w:numId w:val="2"/>
+        </w:numPr>
+        <w:spacing w:after="60"/>
+      </w:pPr>
+      <w:r>
+        <w:rPr>
+          <w:rFonts w:ascii="Calibri" w:cs="Calibri" w:eastAsia="Calibri" w:hAnsi="Calibri"/>
+          <w:sz w:val="22"/>
+          <w:szCs w:val="22"/>
+        </w:rPr>
+        <w:t xml:space="preserve">Web live tại </w:t>
+      </w:r>
       <w:r>
         <w:rPr>
           <w:rFonts w:ascii="Calibri" w:cs="Calibri" w:eastAsia="Calibri" w:hAnsi="Calibri"/>
@@ -800,7 +942,7 @@
           <w:sz w:val="22"/>
           <w:szCs w:val="22"/>
         </w:rPr>
-        <w:t xml:space="preserve">; mọi thay đổi đã merge main + push GitHub.</w:t>
+        <w:t xml:space="preserve">; đã merge main + push GitHub. Code sạch: TypeScript strict, 0 lỗi, i18n VI/EN cân bằng (317 key), không console.log/TODO.</w:t>
       </w:r>
     </w:p>
     <w:p>
@@ -820,51 +962,51 @@
           <w:sz w:val="22"/>
           <w:szCs w:val="22"/>
         </w:rPr>
-        <w:t xml:space="preserve">Bạn cần chạy trong Supabase SQL Editor: </w:t>
-      </w:r>
-      <w:r>
-        <w:rPr>
-          <w:rFonts w:ascii="Calibri" w:cs="Calibri" w:eastAsia="Calibri" w:hAnsi="Calibri"/>
-          <w:sz w:val="22"/>
-          <w:szCs w:val="22"/>
-        </w:rPr>
-        <w:t xml:space="preserve">risk-config.sql, grade-lock.sql (bắt buộc cho cấu hình &amp; khóa điểm); khuyến nghị rls-major-scope.sql + bật Confirm email.</w:t>
-      </w:r>
-    </w:p>
-    <w:p>
-      <w:pPr>
-        <w:pStyle w:val="ListParagraph"/>
-        <w:numPr>
-          <w:ilvl w:val="0"/>
-          <w:numId w:val="2"/>
-        </w:numPr>
-        <w:spacing w:after="60"/>
-      </w:pPr>
-      <w:r>
-        <w:rPr>
-          <w:rFonts w:ascii="Calibri" w:cs="Calibri" w:eastAsia="Calibri" w:hAnsi="Calibri"/>
-          <w:sz w:val="22"/>
-          <w:szCs w:val="22"/>
-        </w:rPr>
-        <w:t xml:space="preserve">Đặt SUPABASE_SERVICE_ROLE_KEY + GMAIL_USER/GMAIL_APP_PASSWORD trên Vercel (tạo tài khoản &amp; gửi email).</w:t>
-      </w:r>
-    </w:p>
-    <w:p>
-      <w:pPr>
-        <w:pStyle w:val="ListParagraph"/>
-        <w:numPr>
-          <w:ilvl w:val="0"/>
-          <w:numId w:val="2"/>
-        </w:numPr>
-        <w:spacing w:after="60"/>
-      </w:pPr>
-      <w:r>
-        <w:rPr>
-          <w:rFonts w:ascii="Calibri" w:cs="Calibri" w:eastAsia="Calibri" w:hAnsi="Calibri"/>
-          <w:sz w:val="22"/>
-          <w:szCs w:val="22"/>
-        </w:rPr>
-        <w:t xml:space="preserve">Nợ nhỏ có thể dọn: ~20 key i18n chết + cơ chế “mã cố vấn” không còn dùng.</w:t>
+        <w:t xml:space="preserve">Cần chạy trong Supabase SQL Editor (3 file): </w:t>
+      </w:r>
+      <w:r>
+        <w:rPr>
+          <w:rFonts w:ascii="Calibri" w:cs="Calibri" w:eastAsia="Calibri" w:hAnsi="Calibri"/>
+          <w:sz w:val="22"/>
+          <w:szCs w:val="22"/>
+        </w:rPr>
+        <w:t xml:space="preserve">rls-major-scope.sql (bảo mật — siết cố vấn theo ngành); risk-config.sql + grade-lock.sql (bật Cấu hình rủi ro &amp; Khóa điểm — hiện 2 bảng này chưa có trong DB).</w:t>
+      </w:r>
+    </w:p>
+    <w:p>
+      <w:pPr>
+        <w:pStyle w:val="ListParagraph"/>
+        <w:numPr>
+          <w:ilvl w:val="0"/>
+          <w:numId w:val="2"/>
+        </w:numPr>
+        <w:spacing w:after="60"/>
+      </w:pPr>
+      <w:r>
+        <w:rPr>
+          <w:rFonts w:ascii="Calibri" w:cs="Calibri" w:eastAsia="Calibri" w:hAnsi="Calibri"/>
+          <w:sz w:val="22"/>
+          <w:szCs w:val="22"/>
+        </w:rPr>
+        <w:t xml:space="preserve">Vercel → Environment Variables: SUPABASE_SERVICE_ROLE_KEY (tạo tài khoản), GMAIL_USER + GMAIL_APP_PASSWORD (gửi email).</w:t>
+      </w:r>
+    </w:p>
+    <w:p>
+      <w:pPr>
+        <w:pStyle w:val="ListParagraph"/>
+        <w:numPr>
+          <w:ilvl w:val="0"/>
+          <w:numId w:val="2"/>
+        </w:numPr>
+        <w:spacing w:after="60"/>
+      </w:pPr>
+      <w:r>
+        <w:rPr>
+          <w:rFonts w:ascii="Calibri" w:cs="Calibri" w:eastAsia="Calibri" w:hAnsi="Calibri"/>
+          <w:sz w:val="22"/>
+          <w:szCs w:val="22"/>
+        </w:rPr>
+        <w:t xml:space="preserve">Lưu ý: mật khẩu demo Sv@123456 đã public do commit file mẫu — đổi nếu cần bảo mật thật.</w:t>
       </w:r>
     </w:p>
     <w:p>
@@ -1065,18 +1207,6 @@
       <w:lvlJc w:val="left"/>
       <w:pPr>
         <w:ind w:left="460" w:hanging="240"/>
-      </w:pPr>
-    </w:lvl>
-  </w:abstractNum>
-  <w:abstractNum w:abstractNumId="3" w15:restartNumberingAfterBreak="0">
-    <w:multiLevelType w:val="hybridMultilevel"/>
-    <w:lvl w:ilvl="0" w15:tentative="1">
-      <w:start w:val="1"/>
-      <w:numFmt w:val="decimal"/>
-      <w:lvlText w:val="%1."/>
-      <w:lvlJc w:val="left"/>
-      <w:pPr>
-        <w:ind w:left="460" w:hanging="300"/>
       </w:pPr>
     </w:lvl>
   </w:abstractNum>

</xml_diff>